<commit_message>
feat: add new certificate of recognition templates for quarterly and secondary reports
</commit_message>
<xml_diff>
--- a/Landing/Login/Page/template/Certificate_of_Recognition_per_Quarter_template.docx
+++ b/Landing/Login/Page/template/Certificate_of_Recognition_per_Quarter_template.docx
@@ -979,7 +979,7 @@
                             <w:pPr>
                               <w:jc w:val="center"/>
                               <w:rPr>
-                                <w:rFonts w:ascii="Edwardian Script ITC" w:hAnsi="Edwardian Script ITC"/>
+                                <w:rFonts w:ascii="Garamond" w:hAnsi="Garamond"/>
                                 <w:b/>
                                 <w:bCs/>
                                 <w:color w:val="000000" w:themeColor="text1"/>
@@ -1002,7 +1002,7 @@
                             </w:pPr>
                             <w:r>
                               <w:rPr>
-                                <w:rFonts w:ascii="Edwardian Script ITC" w:hAnsi="Edwardian Script ITC"/>
+                                <w:rFonts w:ascii="Garamond" w:hAnsi="Garamond"/>
                                 <w:b/>
                                 <w:bCs/>
                                 <w:color w:val="000000" w:themeColor="text1"/>
@@ -1061,7 +1061,7 @@
                       <w:pPr>
                         <w:jc w:val="center"/>
                         <w:rPr>
-                          <w:rFonts w:ascii="Edwardian Script ITC" w:hAnsi="Edwardian Script ITC"/>
+                          <w:rFonts w:ascii="Garamond" w:hAnsi="Garamond"/>
                           <w:b/>
                           <w:bCs/>
                           <w:color w:val="000000" w:themeColor="text1"/>
@@ -1084,7 +1084,7 @@
                       </w:pPr>
                       <w:r>
                         <w:rPr>
-                          <w:rFonts w:ascii="Edwardian Script ITC" w:hAnsi="Edwardian Script ITC"/>
+                          <w:rFonts w:ascii="Garamond" w:hAnsi="Garamond"/>
                           <w:b/>
                           <w:bCs/>
                           <w:color w:val="000000" w:themeColor="text1"/>
@@ -4246,7 +4246,7 @@
                             <w:pPr>
                               <w:jc w:val="center"/>
                               <w:rPr>
-                                <w:rFonts w:ascii="Edwardian Script ITC" w:hAnsi="Edwardian Script ITC"/>
+                                <w:rFonts w:ascii="Garamond" w:hAnsi="Garamond"/>
                                 <w:b/>
                                 <w:bCs/>
                                 <w:color w:val="000000" w:themeColor="text1"/>
@@ -4269,7 +4269,7 @@
                             </w:pPr>
                             <w:r>
                               <w:rPr>
-                                <w:rFonts w:ascii="Edwardian Script ITC" w:hAnsi="Edwardian Script ITC"/>
+                                <w:rFonts w:ascii="Garamond" w:hAnsi="Garamond"/>
                                 <w:b/>
                                 <w:bCs/>
                                 <w:color w:val="000000" w:themeColor="text1"/>
@@ -4328,7 +4328,7 @@
                       <w:pPr>
                         <w:jc w:val="center"/>
                         <w:rPr>
-                          <w:rFonts w:ascii="Edwardian Script ITC" w:hAnsi="Edwardian Script ITC"/>
+                          <w:rFonts w:ascii="Garamond" w:hAnsi="Garamond"/>
                           <w:b/>
                           <w:bCs/>
                           <w:color w:val="000000" w:themeColor="text1"/>
@@ -4351,7 +4351,7 @@
                       </w:pPr>
                       <w:r>
                         <w:rPr>
-                          <w:rFonts w:ascii="Edwardian Script ITC" w:hAnsi="Edwardian Script ITC"/>
+                          <w:rFonts w:ascii="Garamond" w:hAnsi="Garamond"/>
                           <w:b/>
                           <w:bCs/>
                           <w:color w:val="000000" w:themeColor="text1"/>

</xml_diff>